<commit_message>
orders chapters, placeholder documents
</commit_message>
<xml_diff>
--- a/Content/BuildingTheDevice_WesInTheorchard.docx
+++ b/Content/BuildingTheDevice_WesInTheorchard.docx
@@ -750,15 +750,38 @@
         <w:t>He was not.</w:t>
       </w:r>
     </w:p>
-    <w:p>
-      <w:r>
-        <w:t xml:space="preserve">Productivity was hampered by frequent trips to the </w:t>
+    <w:p/>
+    <w:p>
+      <w:r>
+        <w:t xml:space="preserve">**************** This part moved to </w:t>
+      </w:r>
+      <w:proofErr w:type="spellStart"/>
+      <w:r>
+        <w:t>buford</w:t>
+      </w:r>
+      <w:proofErr w:type="spellEnd"/>
+      <w:r>
+        <w:t xml:space="preserve"> begins work</w:t>
+      </w:r>
+      <w:r>
+        <w:t xml:space="preserve"> in act2</w:t>
+      </w:r>
+    </w:p>
+    <w:p/>
+    <w:p>
+      <w:r>
+        <w:t xml:space="preserve">Productivity was hampered by frequent trips to </w:t>
+      </w:r>
+      <w:proofErr w:type="gramStart"/>
+      <w:r>
+        <w:t xml:space="preserve">the </w:t>
       </w:r>
       <w:proofErr w:type="spellStart"/>
       <w:r>
         <w:t>Fissionburry</w:t>
       </w:r>
       <w:proofErr w:type="spellEnd"/>
+      <w:proofErr w:type="gramEnd"/>
       <w:r>
         <w:t xml:space="preserve">. Most of his </w:t>
       </w:r>
@@ -806,25 +829,7 @@
       </w:r>
       <w:proofErr w:type="gramEnd"/>
       <w:r>
-        <w:t xml:space="preserve"> the bottom of the machine. The shelled nuts fell </w:t>
-      </w:r>
-      <w:r>
-        <w:t>through</w:t>
-      </w:r>
-      <w:r>
-        <w:t xml:space="preserve"> a chute</w:t>
-      </w:r>
-      <w:r>
-        <w:t xml:space="preserve"> and exited into an opening</w:t>
-      </w:r>
-      <w:r>
-        <w:t xml:space="preserve"> flanked by two spinning</w:t>
-      </w:r>
-      <w:r>
-        <w:t xml:space="preserve"> wheels</w:t>
-      </w:r>
-      <w:r>
-        <w:t xml:space="preserve"> that ejected them forcefully out the back.</w:t>
+        <w:t xml:space="preserve"> the bottom of the machine. The shelled nuts fell through a chute and exited into an opening flanked by two spinning wheels that ejected them forcefully out the back.</w:t>
       </w:r>
     </w:p>
     <w:p>
@@ -837,10 +842,7 @@
       </w:r>
       <w:proofErr w:type="gramEnd"/>
       <w:r>
-        <w:t xml:space="preserve"> and he left it in place.</w:t>
-      </w:r>
-      <w:r>
-        <w:t xml:space="preserve"> The wheels were wood </w:t>
+        <w:t xml:space="preserve"> and he left it in place. The wheels were wood </w:t>
       </w:r>
       <w:proofErr w:type="gramStart"/>
       <w:r>
@@ -861,10 +863,7 @@
       <w:proofErr w:type="spellEnd"/>
       <w:proofErr w:type="gramEnd"/>
       <w:r>
-        <w:t xml:space="preserve"> they might have come from a covered wagon. Buford did not know their </w:t>
-      </w:r>
-      <w:r>
-        <w:t>origin. He fitted them with rubber tires.</w:t>
+        <w:t xml:space="preserve"> they might have come from a covered wagon. Buford did not know their origin. He fitted them with rubber tires.</w:t>
       </w:r>
     </w:p>
     <w:p>
@@ -877,319 +876,307 @@
       </w:r>
       <w:proofErr w:type="gramEnd"/>
       <w:r>
-        <w:t xml:space="preserve"> and which Buford also worked at with an angle grinder and a ball-peen hammer. When built out, it would have a system of blades and rails for securing slicing and splitting the nuts. Buford hadn’t worked this part out yet</w:t>
-      </w:r>
-      <w:r>
-        <w:t>. He had been counting on his brother</w:t>
-      </w:r>
-      <w:r>
-        <w:t xml:space="preserve"> Cletus</w:t>
-      </w:r>
-      <w:r>
-        <w:t xml:space="preserve"> to help him with that, but he refused</w:t>
+        <w:t xml:space="preserve"> and which Buford also worked at with an angle grinder and a ball-peen hammer. When built out, it would have a system of blades and rails for securing slicing and splitting the nuts. Buford hadn’t worked this part out yet. He had been counting on his brother Cletus to help him with that, but he refused. Buford got the </w:t>
+      </w:r>
+      <w:r>
+        <w:lastRenderedPageBreak/>
+        <w:t>feeding and ejection mechanisms working on his own and was eager to see hazelnuts fly from the device.</w:t>
+      </w:r>
+    </w:p>
+    <w:p>
+      <w:r>
+        <w:t xml:space="preserve">He connected it to the Farmall </w:t>
+      </w:r>
+      <w:proofErr w:type="spellStart"/>
+      <w:r>
+        <w:t>pto</w:t>
+      </w:r>
+      <w:proofErr w:type="spellEnd"/>
+      <w:r>
+        <w:t>, revved it up and shoveled hazelnuts into the hopper with a flat-bottomed spade. That prototype flew apart violently under test. Buford required a trip to the emergency room and might have died if the flask in his vest pocket</w:t>
+      </w:r>
+      <w:r>
+        <w:t xml:space="preserve"> </w:t>
+      </w:r>
+      <w:r>
+        <w:t>hadn’t dulled the impact of a flying piece of debris.</w:t>
+      </w:r>
+    </w:p>
+    <w:p>
+      <w:r>
+        <w:t>Buford resoldered his flask and continued.</w:t>
+      </w:r>
+    </w:p>
+    <w:p>
+      <w:r>
+        <w:t>***************************</w:t>
+      </w:r>
+    </w:p>
+    <w:p>
+      <w:r>
+        <w:t>Buford woke to find Wesley standing beside his bed. Wesley hadn’t made a sound. He didn’t need to. He was hardwired into Buford and his presence alone was enough to wake him from the soundest of sleep.</w:t>
+      </w:r>
+    </w:p>
+    <w:p/>
+    <w:p>
+      <w:r>
+        <w:t>“Yeah, son?”</w:t>
+      </w:r>
+    </w:p>
+    <w:p>
+      <w:r>
+        <w:t>“Can I sleep with you tonight?”</w:t>
+      </w:r>
+    </w:p>
+    <w:p>
+      <w:r>
+        <w:t>“</w:t>
+      </w:r>
+      <w:proofErr w:type="gramStart"/>
+      <w:r>
+        <w:t>No</w:t>
+      </w:r>
+      <w:proofErr w:type="gramEnd"/>
+      <w:r>
+        <w:t xml:space="preserve"> you can’t</w:t>
+      </w:r>
+      <w:r>
+        <w:t>!</w:t>
+      </w:r>
+      <w:r>
+        <w:t xml:space="preserve"> Go back to bed</w:t>
+      </w:r>
+      <w:r>
+        <w:t>!</w:t>
+      </w:r>
+      <w:r>
+        <w:t>”</w:t>
+      </w:r>
+    </w:p>
+    <w:p>
+      <w:r>
+        <w:t xml:space="preserve">“Dad, please. I don’t </w:t>
+      </w:r>
+      <w:proofErr w:type="spellStart"/>
+      <w:r>
+        <w:t>wanna</w:t>
+      </w:r>
+      <w:proofErr w:type="spellEnd"/>
+      <w:r>
+        <w:t xml:space="preserve"> sleep by myself.”</w:t>
+      </w:r>
+    </w:p>
+    <w:p>
+      <w:r>
+        <w:t>“The dogs are sleeping with you.”</w:t>
+      </w:r>
+    </w:p>
+    <w:p>
+      <w:r>
+        <w:t>“I need you</w:t>
+      </w:r>
+      <w:r>
+        <w:t>.”</w:t>
+      </w:r>
+    </w:p>
+    <w:p>
+      <w:r>
+        <w:t>Buford sat up against his headboard</w:t>
+      </w:r>
+      <w:r>
+        <w:t xml:space="preserve"> and </w:t>
+      </w:r>
+      <w:r>
+        <w:t>stretched an arm toward Wes.</w:t>
+      </w:r>
+    </w:p>
+    <w:p>
+      <w:r>
+        <w:t>“Come here,” he said.</w:t>
+      </w:r>
+    </w:p>
+    <w:p>
+      <w:r>
+        <w:t>He held Wes in an embrace.</w:t>
+      </w:r>
+    </w:p>
+    <w:p>
+      <w:r>
+        <w:t xml:space="preserve">“Now we’ve been over </w:t>
+      </w:r>
+      <w:r>
+        <w:t>and over this. You’re almost 1</w:t>
+      </w:r>
+      <w:r>
+        <w:t>3</w:t>
+      </w:r>
+      <w:r>
+        <w:t xml:space="preserve"> and you</w:t>
+      </w:r>
+      <w:r>
+        <w:t xml:space="preserve"> </w:t>
+      </w:r>
+      <w:proofErr w:type="gramStart"/>
+      <w:r>
+        <w:t>have to</w:t>
+      </w:r>
+      <w:proofErr w:type="gramEnd"/>
+      <w:r>
+        <w:t xml:space="preserve"> </w:t>
+      </w:r>
+      <w:r>
+        <w:t xml:space="preserve">sleep through the night in your own bed. You’ve been doing great </w:t>
+      </w:r>
+      <w:r>
+        <w:t>for a long time</w:t>
+      </w:r>
+      <w:r>
+        <w:t>.</w:t>
+      </w:r>
+      <w:r>
+        <w:t>”</w:t>
+      </w:r>
+    </w:p>
+    <w:p>
+      <w:r>
+        <w:t>“There’s something in my room,” Wes said.</w:t>
+      </w:r>
+      <w:r>
+        <w:t xml:space="preserve"> “It’s a giant snake.”</w:t>
+      </w:r>
+    </w:p>
+    <w:p>
+      <w:r>
+        <w:t>“Son</w:t>
+      </w:r>
+      <w:r>
+        <w:t>,” Buford said, with a pleading sort of tone. He sighed</w:t>
+      </w:r>
+      <w:r>
+        <w:t xml:space="preserve"> and rose in his </w:t>
+      </w:r>
+      <w:r>
+        <w:t xml:space="preserve">boxer briefs. </w:t>
+      </w:r>
+      <w:r>
+        <w:t xml:space="preserve">He found </w:t>
+      </w:r>
+      <w:proofErr w:type="gramStart"/>
+      <w:r>
+        <w:t>a t</w:t>
+      </w:r>
+      <w:proofErr w:type="gramEnd"/>
+      <w:r>
+        <w:t>-shirt on the floor and put it on</w:t>
+      </w:r>
+      <w:r>
+        <w:t>, covering the large ban</w:t>
+      </w:r>
+      <w:r>
+        <w:t>dag</w:t>
+      </w:r>
+      <w:r>
+        <w:t xml:space="preserve">e </w:t>
+      </w:r>
+      <w:proofErr w:type="gramStart"/>
+      <w:r>
+        <w:t>overt</w:t>
+      </w:r>
+      <w:proofErr w:type="gramEnd"/>
+      <w:r>
+        <w:t xml:space="preserve"> his chest.</w:t>
+      </w:r>
+    </w:p>
+    <w:p>
+      <w:r>
+        <w:t>“Come on. I’ll lay in your bed until you</w:t>
+      </w:r>
+      <w:r>
+        <w:t>’re</w:t>
+      </w:r>
+      <w:r>
+        <w:t xml:space="preserve"> asleep.”</w:t>
+      </w:r>
+    </w:p>
+    <w:p>
+      <w:r>
+        <w:t>“But when I’m asleep you’ll get up and come back to your own bed</w:t>
+      </w:r>
+      <w:r>
+        <w:t>?</w:t>
+      </w:r>
+      <w:r>
+        <w:t>”</w:t>
+      </w:r>
+    </w:p>
+    <w:p>
+      <w:r>
+        <w:t>“Yeah.”</w:t>
+      </w:r>
+    </w:p>
+    <w:p>
+      <w:r>
+        <w:t>“</w:t>
+      </w:r>
+      <w:proofErr w:type="spellStart"/>
+      <w:r>
+        <w:t>Nevermind</w:t>
+      </w:r>
+      <w:proofErr w:type="spellEnd"/>
+      <w:r>
+        <w:t xml:space="preserve">,” said Wes. </w:t>
+      </w:r>
+      <w:r>
+        <w:t>“I’m good.”</w:t>
+      </w:r>
+    </w:p>
+    <w:p>
+      <w:r>
+        <w:t>“That’s a good boy</w:t>
+      </w:r>
+      <w:r>
+        <w:t xml:space="preserve">.” </w:t>
+      </w:r>
+    </w:p>
+    <w:p>
+      <w:r>
+        <w:t xml:space="preserve">Buford </w:t>
+      </w:r>
+      <w:r>
+        <w:t>sat on his bed</w:t>
       </w:r>
       <w:r>
         <w:t xml:space="preserve">. </w:t>
       </w:r>
-      <w:r>
-        <w:t>Buford</w:t>
-      </w:r>
-      <w:r>
-        <w:t xml:space="preserve"> got the feeding and ejection mechanisms working</w:t>
-      </w:r>
-      <w:r>
-        <w:t xml:space="preserve"> on his own</w:t>
-      </w:r>
-      <w:r>
-        <w:t xml:space="preserve"> and was eager to see hazelnuts fly from the device.</w:t>
-      </w:r>
-    </w:p>
-    <w:p>
-      <w:r>
-        <w:t xml:space="preserve">He connected it to the Farmall </w:t>
-      </w:r>
-      <w:proofErr w:type="spellStart"/>
-      <w:r>
-        <w:t>pto</w:t>
-      </w:r>
-      <w:proofErr w:type="spellEnd"/>
-      <w:r>
-        <w:t xml:space="preserve">, revved it up and shoveled hazelnuts into the hopper with a flat-bottomed spade. That prototype flew apart violently under test. Buford required a trip to the emergency </w:t>
-      </w:r>
+      <w:proofErr w:type="gramStart"/>
+      <w:r>
+        <w:t>Consistenc</w:t>
+      </w:r>
+      <w:r>
+        <w:t>y</w:t>
+      </w:r>
+      <w:proofErr w:type="gramEnd"/>
+      <w:r>
+        <w:t xml:space="preserve">, he thought. That’s the hallmark of parenting. All the books and </w:t>
+      </w:r>
+      <w:r>
+        <w:t xml:space="preserve">all the counselors have said that. </w:t>
+      </w:r>
+      <w:r>
+        <w:t xml:space="preserve">They had to be right, even if it didn’t </w:t>
+      </w:r>
+      <w:proofErr w:type="gramStart"/>
+      <w:r>
+        <w:t>seem</w:t>
+      </w:r>
+      <w:proofErr w:type="gramEnd"/>
+      <w:r>
+        <w:t xml:space="preserve"> it.</w:t>
+      </w:r>
+    </w:p>
+    <w:p>
       <w:r>
         <w:lastRenderedPageBreak/>
-        <w:t>room and might have died if the flask in his vest pocket hadn’t dulled the impact of a flying piece of debris.</w:t>
-      </w:r>
-    </w:p>
-    <w:p>
-      <w:r>
-        <w:t>Buford resoldered his flask and continued.</w:t>
-      </w:r>
-    </w:p>
-    <w:p>
-      <w:r>
-        <w:t>Buford woke to find Wesley standing beside his bed. Wesley hadn’t made a sound. He didn’t need to. He was hardwired into Buford and his presence alone was enough to wake him from the soundest of sleep.</w:t>
-      </w:r>
-    </w:p>
-    <w:p/>
-    <w:p>
-      <w:r>
-        <w:t>“Yeah, son?”</w:t>
-      </w:r>
-    </w:p>
-    <w:p>
-      <w:r>
-        <w:t>“Can I sleep with you tonight?”</w:t>
-      </w:r>
-    </w:p>
-    <w:p>
-      <w:r>
-        <w:t>“</w:t>
-      </w:r>
-      <w:proofErr w:type="gramStart"/>
-      <w:r>
-        <w:t>No</w:t>
-      </w:r>
-      <w:proofErr w:type="gramEnd"/>
-      <w:r>
-        <w:t xml:space="preserve"> you can’t</w:t>
-      </w:r>
-      <w:r>
-        <w:t>!</w:t>
-      </w:r>
-      <w:r>
-        <w:t xml:space="preserve"> Go back to bed</w:t>
-      </w:r>
-      <w:r>
-        <w:t>!</w:t>
-      </w:r>
-      <w:r>
-        <w:t>”</w:t>
-      </w:r>
-    </w:p>
-    <w:p>
-      <w:r>
-        <w:t xml:space="preserve">“Dad, please. I don’t </w:t>
-      </w:r>
-      <w:proofErr w:type="spellStart"/>
-      <w:r>
-        <w:t>wanna</w:t>
-      </w:r>
-      <w:proofErr w:type="spellEnd"/>
-      <w:r>
-        <w:t xml:space="preserve"> sleep by myself.”</w:t>
-      </w:r>
-    </w:p>
-    <w:p>
-      <w:r>
-        <w:t>“The dogs are sleeping with you.”</w:t>
-      </w:r>
-    </w:p>
-    <w:p>
-      <w:r>
-        <w:t>“I need you</w:t>
-      </w:r>
-      <w:r>
-        <w:t>.”</w:t>
-      </w:r>
-    </w:p>
-    <w:p>
-      <w:r>
-        <w:t>Buford sat up against his headboard</w:t>
-      </w:r>
-      <w:r>
-        <w:t xml:space="preserve"> and </w:t>
-      </w:r>
-      <w:r>
-        <w:t>stretched an arm toward Wes.</w:t>
-      </w:r>
-    </w:p>
-    <w:p>
-      <w:r>
-        <w:t>“Come here,” he said.</w:t>
-      </w:r>
-    </w:p>
-    <w:p>
-      <w:r>
-        <w:t>He held Wes in an embrace.</w:t>
-      </w:r>
-    </w:p>
-    <w:p>
-      <w:r>
-        <w:t xml:space="preserve">“Now we’ve been over </w:t>
-      </w:r>
-      <w:r>
-        <w:t>and over this. You’re almost 1</w:t>
-      </w:r>
-      <w:r>
-        <w:t>3</w:t>
-      </w:r>
-      <w:r>
-        <w:t xml:space="preserve"> and you</w:t>
-      </w:r>
-      <w:r>
-        <w:t xml:space="preserve"> </w:t>
-      </w:r>
-      <w:proofErr w:type="gramStart"/>
-      <w:r>
-        <w:t>have to</w:t>
-      </w:r>
-      <w:proofErr w:type="gramEnd"/>
-      <w:r>
-        <w:t xml:space="preserve"> </w:t>
-      </w:r>
-      <w:r>
-        <w:t xml:space="preserve">sleep through the night in your own bed. You’ve been doing great </w:t>
-      </w:r>
-      <w:r>
-        <w:t>for a long time</w:t>
-      </w:r>
-      <w:r>
-        <w:t>.</w:t>
-      </w:r>
-      <w:r>
-        <w:t>”</w:t>
-      </w:r>
-    </w:p>
-    <w:p>
-      <w:r>
-        <w:t>“There’s something in my room,” Wes said.</w:t>
-      </w:r>
-      <w:r>
-        <w:t xml:space="preserve"> “It’s a giant snake.”</w:t>
-      </w:r>
-    </w:p>
-    <w:p>
-      <w:r>
-        <w:t>“Son</w:t>
-      </w:r>
-      <w:r>
-        <w:t>,” Buford said, with a pleading sort of tone. He sighed</w:t>
-      </w:r>
-      <w:r>
-        <w:t xml:space="preserve"> and rose in his </w:t>
-      </w:r>
-      <w:r>
-        <w:t xml:space="preserve">boxer briefs. </w:t>
-      </w:r>
-      <w:r>
-        <w:t xml:space="preserve">He found </w:t>
-      </w:r>
-      <w:proofErr w:type="gramStart"/>
-      <w:r>
-        <w:t>a t</w:t>
-      </w:r>
-      <w:proofErr w:type="gramEnd"/>
-      <w:r>
-        <w:t>-shirt on the floor and put it on</w:t>
-      </w:r>
-      <w:r>
-        <w:t>, covering the large ban</w:t>
-      </w:r>
-      <w:r>
-        <w:t>dag</w:t>
-      </w:r>
-      <w:r>
-        <w:t xml:space="preserve">e </w:t>
-      </w:r>
-      <w:proofErr w:type="gramStart"/>
-      <w:r>
-        <w:t>overt</w:t>
-      </w:r>
-      <w:proofErr w:type="gramEnd"/>
-      <w:r>
-        <w:t xml:space="preserve"> his chest.</w:t>
-      </w:r>
-    </w:p>
-    <w:p>
-      <w:r>
-        <w:t>“Come on. I’ll lay in your bed until you</w:t>
-      </w:r>
-      <w:r>
-        <w:t>’re</w:t>
-      </w:r>
-      <w:r>
-        <w:t xml:space="preserve"> asleep.”</w:t>
-      </w:r>
-    </w:p>
-    <w:p>
-      <w:r>
-        <w:t>“But when I’m asleep you’ll get up and come back to your own bed</w:t>
-      </w:r>
-      <w:r>
-        <w:t>?</w:t>
-      </w:r>
-      <w:r>
-        <w:t>”</w:t>
-      </w:r>
-    </w:p>
-    <w:p>
-      <w:r>
-        <w:t>“Yeah.”</w:t>
-      </w:r>
-    </w:p>
-    <w:p>
-      <w:r>
-        <w:t>“</w:t>
-      </w:r>
-      <w:proofErr w:type="spellStart"/>
-      <w:r>
-        <w:t>Nevermind</w:t>
-      </w:r>
-      <w:proofErr w:type="spellEnd"/>
-      <w:r>
-        <w:t xml:space="preserve">,” said Wes. </w:t>
-      </w:r>
-      <w:r>
-        <w:t>“I’m good.”</w:t>
-      </w:r>
-    </w:p>
-    <w:p>
-      <w:r>
-        <w:t>“That’s a good boy</w:t>
-      </w:r>
-      <w:r>
-        <w:t xml:space="preserve">.” </w:t>
-      </w:r>
-    </w:p>
-    <w:p>
-      <w:r>
-        <w:t xml:space="preserve">Buford </w:t>
-      </w:r>
-      <w:r>
-        <w:t>sat on his bed</w:t>
-      </w:r>
-      <w:r>
-        <w:t xml:space="preserve">. </w:t>
-      </w:r>
-      <w:proofErr w:type="gramStart"/>
-      <w:r>
-        <w:t>Consistenc</w:t>
-      </w:r>
-      <w:r>
-        <w:t>y</w:t>
-      </w:r>
-      <w:proofErr w:type="gramEnd"/>
-      <w:r>
-        <w:t xml:space="preserve">, he thought. That’s the hallmark of parenting. All the books and </w:t>
-      </w:r>
-      <w:r>
-        <w:t xml:space="preserve">all the counselors have said that. </w:t>
-      </w:r>
-      <w:r>
-        <w:t xml:space="preserve">They had to be right, even if it didn’t </w:t>
-      </w:r>
-      <w:proofErr w:type="gramStart"/>
-      <w:r>
-        <w:t>seem</w:t>
-      </w:r>
-      <w:proofErr w:type="gramEnd"/>
-      <w:r>
-        <w:t xml:space="preserve"> it.</w:t>
-      </w:r>
-    </w:p>
-    <w:p>
-      <w:r>
         <w:t xml:space="preserve">Wes disappeared out of the room, </w:t>
       </w:r>
       <w:r>
@@ -1513,15 +1500,7 @@
         <w:t>too exposed</w:t>
       </w:r>
       <w:r>
-        <w:t xml:space="preserve"> on this night. The headlights woke </w:t>
-      </w:r>
-      <w:proofErr w:type="gramStart"/>
-      <w:r>
-        <w:t>Cletus</w:t>
-      </w:r>
-      <w:proofErr w:type="gramEnd"/>
-      <w:r>
-        <w:t xml:space="preserve"> and they didn’t have to knock.</w:t>
+        <w:t xml:space="preserve"> on this night. The headlights woke Cletus and they didn’t have to knock.</w:t>
       </w:r>
     </w:p>
     <w:p>
@@ -1652,6 +1631,7 @@
     </w:p>
     <w:p>
       <w:r>
+        <w:lastRenderedPageBreak/>
         <w:t>Cletus shut the door but didn’t latch it.</w:t>
       </w:r>
     </w:p>
@@ -1662,7 +1642,6 @@
     </w:p>
     <w:p>
       <w:r>
-        <w:lastRenderedPageBreak/>
         <w:t>While Cletus worked on the machine, Bufo</w:t>
       </w:r>
       <w:r>
@@ -1965,7 +1944,6 @@
     <w:p/>
     <w:p>
       <w:r>
-        <w:lastRenderedPageBreak/>
         <w:t>“This can’t continue</w:t>
       </w:r>
       <w:r>
@@ -2243,6 +2221,7 @@
     <w:p/>
     <w:p>
       <w:r>
+        <w:lastRenderedPageBreak/>
         <w:t xml:space="preserve">The crow perched on </w:t>
       </w:r>
       <w:r>
@@ -2283,7 +2262,6 @@
     </w:p>
     <w:p>
       <w:r>
-        <w:lastRenderedPageBreak/>
         <w:t>“No</w:t>
       </w:r>
       <w:r>
@@ -2589,420 +2567,419 @@
     </w:p>
     <w:p>
       <w:r>
+        <w:t>“Yes,</w:t>
+      </w:r>
+      <w:r>
+        <w:t>”</w:t>
+      </w:r>
+      <w:r>
+        <w:t xml:space="preserve"> said the seer.</w:t>
+      </w:r>
+      <w:r>
+        <w:t xml:space="preserve"> </w:t>
+      </w:r>
+      <w:r>
+        <w:t>“She may never be completely gone from the boy</w:t>
+      </w:r>
+      <w:r>
+        <w:t xml:space="preserve"> now that she’s squeezed her way in.</w:t>
+      </w:r>
+      <w:r>
+        <w:t xml:space="preserve"> Wes can’t control </w:t>
+      </w:r>
+      <w:proofErr w:type="gramStart"/>
+      <w:r>
+        <w:t>her</w:t>
+      </w:r>
+      <w:proofErr w:type="gramEnd"/>
+      <w:r>
+        <w:t xml:space="preserve"> but he can control the</w:t>
+      </w:r>
+      <w:r>
+        <w:t xml:space="preserve"> power she has over him.</w:t>
+      </w:r>
+      <w:r>
+        <w:t xml:space="preserve"> The darkness. </w:t>
+      </w:r>
+      <w:r>
+        <w:t>A special kind of peace that comes</w:t>
+      </w:r>
+      <w:r>
+        <w:t xml:space="preserve"> in darkness. </w:t>
+      </w:r>
+      <w:r>
+        <w:t xml:space="preserve">And turn in into the pride and strength of overcoming. </w:t>
+      </w:r>
+      <w:r>
+        <w:t xml:space="preserve">When you look there and find </w:t>
+      </w:r>
+      <w:proofErr w:type="gramStart"/>
+      <w:r>
+        <w:t>a pride</w:t>
+      </w:r>
+      <w:proofErr w:type="gramEnd"/>
+      <w:r>
+        <w:t xml:space="preserve"> in overcom</w:t>
+      </w:r>
+      <w:r>
+        <w:t>ing</w:t>
+      </w:r>
+      <w:r>
+        <w:t xml:space="preserve"> a special kind of peace in the darkness.</w:t>
+      </w:r>
+      <w:r>
+        <w:t xml:space="preserve"> </w:t>
+      </w:r>
+      <w:r>
+        <w:t xml:space="preserve">Assurance of power </w:t>
+      </w:r>
+      <w:proofErr w:type="spellStart"/>
+      <w:r>
+        <w:t>rediscoverd</w:t>
+      </w:r>
+      <w:proofErr w:type="spellEnd"/>
+      <w:r>
+        <w:t>.</w:t>
+      </w:r>
+      <w:r>
+        <w:t xml:space="preserve"> Tall Man has a </w:t>
+      </w:r>
+      <w:proofErr w:type="gramStart"/>
+      <w:r>
+        <w:t>special blessing</w:t>
+      </w:r>
+      <w:r>
+        <w:t>s</w:t>
+      </w:r>
+      <w:proofErr w:type="gramEnd"/>
+      <w:r>
+        <w:t xml:space="preserve"> for th</w:t>
+      </w:r>
+      <w:r>
+        <w:t>e ever-overcoming.</w:t>
+      </w:r>
+      <w:r>
+        <w:t xml:space="preserve"> The white</w:t>
+      </w:r>
+      <w:r>
+        <w:t xml:space="preserve">, where the </w:t>
+      </w:r>
+      <w:proofErr w:type="spellStart"/>
+      <w:r>
+        <w:t>there</w:t>
+      </w:r>
+      <w:proofErr w:type="spellEnd"/>
+      <w:r>
+        <w:t xml:space="preserve"> is </w:t>
+      </w:r>
+      <w:proofErr w:type="spellStart"/>
+      <w:r>
+        <w:t>triump</w:t>
+      </w:r>
+      <w:proofErr w:type="spellEnd"/>
+      <w:r>
+        <w:t xml:space="preserve"> to the west where there is death. </w:t>
+      </w:r>
+      <w:r>
+        <w:t>Who the blue north</w:t>
+      </w:r>
+      <w:r>
+        <w:t xml:space="preserve"> over come the blue north</w:t>
+      </w:r>
+      <w:r>
+        <w:t xml:space="preserve">. Never your friend. </w:t>
+      </w:r>
+      <w:r>
+        <w:t>When the blue north settles in a man.</w:t>
+      </w:r>
+    </w:p>
+    <w:p/>
+    <w:p/>
+    <w:p/>
+    <w:p>
+      <w:r>
+        <w:t xml:space="preserve"> </w:t>
+      </w:r>
+      <w:proofErr w:type="gramStart"/>
+      <w:r>
+        <w:t>Moved</w:t>
+      </w:r>
+      <w:proofErr w:type="gramEnd"/>
+      <w:r>
+        <w:t xml:space="preserve"> </w:t>
+      </w:r>
+      <w:proofErr w:type="gramStart"/>
+      <w:r>
+        <w:t>a hose</w:t>
+      </w:r>
+      <w:proofErr w:type="gramEnd"/>
+      <w:r>
+        <w:t xml:space="preserve"> to a new connector. Buford disappeared into his shop and </w:t>
+      </w:r>
+      <w:proofErr w:type="gramStart"/>
+      <w:r>
+        <w:t>cam</w:t>
+      </w:r>
+      <w:proofErr w:type="gramEnd"/>
+      <w:r>
+        <w:t xml:space="preserve"> back out with some hose clamps and a roll of duct tape with he</w:t>
+      </w:r>
+      <w:r>
+        <w:t xml:space="preserve"> wrapped furiously and untidily around a </w:t>
+      </w:r>
+      <w:r>
+        <w:t>valve cover.</w:t>
+      </w:r>
+    </w:p>
+    <w:p>
+      <w:r>
+        <w:t xml:space="preserve">              </w:t>
+      </w:r>
+    </w:p>
+    <w:p>
+      <w:r>
+        <w:t>Despite the transformation on the inside, t</w:t>
+      </w:r>
+      <w:r>
+        <w:t>he outside of the shop had not changed. A</w:t>
+      </w:r>
+      <w:r>
+        <w:t>n iconic</w:t>
+      </w:r>
+      <w:r>
+        <w:t xml:space="preserve"> board and batting </w:t>
+      </w:r>
+      <w:r>
+        <w:t xml:space="preserve">weathered </w:t>
+      </w:r>
+      <w:r>
+        <w:t xml:space="preserve">pine barn with a mansard roof. </w:t>
+      </w:r>
+      <w:r>
+        <w:t>A group of visitors</w:t>
+      </w:r>
+      <w:r>
+        <w:t xml:space="preserve"> assembled outside </w:t>
+      </w:r>
+      <w:r>
+        <w:t>the double doors. Among them was Ervine</w:t>
+      </w:r>
+      <w:r>
+        <w:t xml:space="preserve"> </w:t>
+      </w:r>
+      <w:r>
+        <w:t>Carter and with him, men in suits</w:t>
+      </w:r>
+      <w:r>
+        <w:t>. T</w:t>
+      </w:r>
+      <w:r>
+        <w:t xml:space="preserve">he venture capitalists who had fronted the money for </w:t>
+      </w:r>
+      <w:r>
+        <w:t xml:space="preserve">Buford’s production facilities. They had come to </w:t>
+      </w:r>
+      <w:r>
+        <w:t xml:space="preserve">see this </w:t>
+      </w:r>
+      <w:r>
+        <w:t>device</w:t>
+      </w:r>
+      <w:r>
+        <w:t xml:space="preserve">, this </w:t>
+      </w:r>
+      <w:proofErr w:type="spellStart"/>
+      <w:r>
+        <w:t>posthumasly</w:t>
+      </w:r>
+      <w:proofErr w:type="spellEnd"/>
+      <w:r>
+        <w:t xml:space="preserve"> of the </w:t>
+      </w:r>
+      <w:proofErr w:type="spellStart"/>
+      <w:r>
+        <w:t>genious</w:t>
+      </w:r>
+      <w:proofErr w:type="spellEnd"/>
+      <w:r>
+        <w:t xml:space="preserve"> of Horace P. Hooper</w:t>
+      </w:r>
+      <w:r>
+        <w:t>, and to see it in action.</w:t>
+      </w:r>
+    </w:p>
+    <w:p>
+      <w:r>
+        <w:t>The men</w:t>
+      </w:r>
+      <w:r>
+        <w:t xml:space="preserve"> waited. The</w:t>
+      </w:r>
+      <w:r>
+        <w:t xml:space="preserve"> purr of the idling </w:t>
+      </w:r>
+      <w:r>
+        <w:t>F</w:t>
+      </w:r>
+      <w:r>
+        <w:t xml:space="preserve">armall could be heard from inside. The barn doors opened and the </w:t>
+      </w:r>
+      <w:r>
+        <w:t>Farmall rolled out, Buford</w:t>
+      </w:r>
+      <w:r>
+        <w:t xml:space="preserve"> at the wheel.</w:t>
+      </w:r>
+      <w:r>
+        <w:t xml:space="preserve"> Cletus rode on the back</w:t>
+      </w:r>
+      <w:r>
+        <w:t xml:space="preserve">, straddling the side arms of the </w:t>
+      </w:r>
+      <w:proofErr w:type="gramStart"/>
+      <w:r>
+        <w:t>three point</w:t>
+      </w:r>
+      <w:proofErr w:type="gramEnd"/>
+      <w:r>
+        <w:t xml:space="preserve"> hitch and turning a nut on the device with a wrench.</w:t>
+      </w:r>
+    </w:p>
+    <w:p>
+      <w:r>
+        <w:t xml:space="preserve">Except for </w:t>
+      </w:r>
+      <w:r>
+        <w:t>Buford’s original</w:t>
+      </w:r>
+      <w:r>
+        <w:t xml:space="preserve"> peened and primed</w:t>
+      </w:r>
+      <w:r>
+        <w:t xml:space="preserve"> hopper </w:t>
+      </w:r>
+      <w:r>
+        <w:t>and the wood spoked wheels</w:t>
+      </w:r>
+      <w:r>
+        <w:t xml:space="preserve">, this prototype bore little resemblance to the first. </w:t>
+      </w:r>
+      <w:r>
+        <w:t xml:space="preserve">Gone was Buford’s Cadillac engine and in </w:t>
+      </w:r>
+      <w:proofErr w:type="gramStart"/>
+      <w:r>
+        <w:t>it’s</w:t>
+      </w:r>
+      <w:proofErr w:type="gramEnd"/>
+      <w:r>
+        <w:t xml:space="preserve"> place a</w:t>
+      </w:r>
+      <w:r>
+        <w:t>n assemblage of hoses</w:t>
+      </w:r>
+      <w:r>
+        <w:t xml:space="preserve">, actuators and servos </w:t>
+      </w:r>
+      <w:proofErr w:type="gramStart"/>
+      <w:r>
+        <w:t>assemble</w:t>
+      </w:r>
+      <w:proofErr w:type="gramEnd"/>
+      <w:r>
+        <w:t xml:space="preserve"> around a white plastic </w:t>
+      </w:r>
+      <w:r>
+        <w:t>housing</w:t>
+      </w:r>
+      <w:r>
+        <w:t>.</w:t>
+      </w:r>
+    </w:p>
+    <w:p>
+      <w:r>
+        <w:t>“It’s like</w:t>
+      </w:r>
+      <w:r>
+        <w:t xml:space="preserve"> a</w:t>
+      </w:r>
+      <w:r>
+        <w:t xml:space="preserve"> robot escaped from the</w:t>
+      </w:r>
+      <w:r>
+        <w:t xml:space="preserve"> auto</w:t>
+      </w:r>
+      <w:r>
+        <w:t xml:space="preserve"> plant, hid out </w:t>
+      </w:r>
+      <w:r>
+        <w:t>in an ag</w:t>
+      </w:r>
+      <w:r>
+        <w:t xml:space="preserve"> museum, and </w:t>
+      </w:r>
+      <w:r>
+        <w:t xml:space="preserve">mated with a farm implement,” </w:t>
+      </w:r>
+    </w:p>
+    <w:p/>
+    <w:p>
+      <w:r>
+        <w:t>Buford dismounted the tractor, leaving it running. He</w:t>
+      </w:r>
+      <w:r>
+        <w:t xml:space="preserve"> was confident. While testing had, by no means, been exhaustive, he had seen each of the components work just as expected at a modular level and saw no reason for the machine not to perform perfectly all put together – work </w:t>
+      </w:r>
+      <w:r>
+        <w:t>Cletus</w:t>
+      </w:r>
+      <w:r>
+        <w:t xml:space="preserve"> was completing</w:t>
+      </w:r>
+      <w:r>
+        <w:t xml:space="preserve"> even now</w:t>
+      </w:r>
+      <w:r>
+        <w:t>.</w:t>
+      </w:r>
+    </w:p>
+    <w:p>
+      <w:r>
+        <w:t xml:space="preserve"> They stood by, casting impatient glances at Ervine Carter while </w:t>
+      </w:r>
+      <w:r>
+        <w:t>Cletus</w:t>
+      </w:r>
+      <w:r>
+        <w:t xml:space="preserve"> tightened bolts fumbled with this or that knob.</w:t>
+      </w:r>
+    </w:p>
+    <w:p>
+      <w:r>
         <w:lastRenderedPageBreak/>
-        <w:t>“Yes,</w:t>
-      </w:r>
-      <w:r>
-        <w:t>”</w:t>
-      </w:r>
-      <w:r>
-        <w:t xml:space="preserve"> said the seer.</w:t>
-      </w:r>
-      <w:r>
-        <w:t xml:space="preserve"> </w:t>
-      </w:r>
-      <w:r>
-        <w:t>“She may never be completely gone from the boy</w:t>
-      </w:r>
-      <w:r>
-        <w:t xml:space="preserve"> now that she’s squeezed her way in.</w:t>
-      </w:r>
-      <w:r>
-        <w:t xml:space="preserve"> Wes can’t control </w:t>
-      </w:r>
-      <w:proofErr w:type="gramStart"/>
-      <w:r>
-        <w:t>her</w:t>
-      </w:r>
-      <w:proofErr w:type="gramEnd"/>
-      <w:r>
-        <w:t xml:space="preserve"> but he can control the</w:t>
-      </w:r>
-      <w:r>
-        <w:t xml:space="preserve"> power she has over him.</w:t>
-      </w:r>
-      <w:r>
-        <w:t xml:space="preserve"> The darkness. </w:t>
-      </w:r>
-      <w:r>
-        <w:t>A special kind of peace that comes</w:t>
-      </w:r>
-      <w:r>
-        <w:t xml:space="preserve"> in darkness. </w:t>
-      </w:r>
-      <w:r>
-        <w:t xml:space="preserve">And turn in into the pride and strength of overcoming. </w:t>
-      </w:r>
-      <w:r>
-        <w:t xml:space="preserve">When you look there and find </w:t>
-      </w:r>
-      <w:proofErr w:type="gramStart"/>
-      <w:r>
-        <w:t>a pride</w:t>
-      </w:r>
-      <w:proofErr w:type="gramEnd"/>
-      <w:r>
-        <w:t xml:space="preserve"> in overcom</w:t>
-      </w:r>
-      <w:r>
-        <w:t>ing</w:t>
-      </w:r>
-      <w:r>
-        <w:t xml:space="preserve"> a special kind of peace in the darkness.</w:t>
-      </w:r>
-      <w:r>
-        <w:t xml:space="preserve"> </w:t>
-      </w:r>
-      <w:r>
-        <w:t xml:space="preserve">Assurance of power </w:t>
-      </w:r>
-      <w:proofErr w:type="spellStart"/>
-      <w:r>
-        <w:t>rediscoverd</w:t>
-      </w:r>
-      <w:proofErr w:type="spellEnd"/>
-      <w:r>
-        <w:t>.</w:t>
-      </w:r>
-      <w:r>
-        <w:t xml:space="preserve"> Tall Man has a </w:t>
-      </w:r>
-      <w:proofErr w:type="gramStart"/>
-      <w:r>
-        <w:t>special blessing</w:t>
-      </w:r>
-      <w:r>
-        <w:t>s</w:t>
-      </w:r>
-      <w:proofErr w:type="gramEnd"/>
-      <w:r>
-        <w:t xml:space="preserve"> for th</w:t>
-      </w:r>
-      <w:r>
-        <w:t>e ever-overcoming.</w:t>
-      </w:r>
-      <w:r>
-        <w:t xml:space="preserve"> The white</w:t>
-      </w:r>
-      <w:r>
-        <w:t xml:space="preserve">, where the </w:t>
-      </w:r>
-      <w:proofErr w:type="spellStart"/>
-      <w:r>
-        <w:t>there</w:t>
-      </w:r>
-      <w:proofErr w:type="spellEnd"/>
-      <w:r>
-        <w:t xml:space="preserve"> is </w:t>
-      </w:r>
-      <w:proofErr w:type="spellStart"/>
-      <w:r>
-        <w:t>triump</w:t>
-      </w:r>
-      <w:proofErr w:type="spellEnd"/>
-      <w:r>
-        <w:t xml:space="preserve"> to the west where there is death. </w:t>
-      </w:r>
-      <w:r>
-        <w:t>Who the blue north</w:t>
-      </w:r>
-      <w:r>
-        <w:t xml:space="preserve"> over come the blue north</w:t>
-      </w:r>
-      <w:r>
-        <w:t xml:space="preserve">. Never your friend. </w:t>
-      </w:r>
-      <w:r>
-        <w:t>When the blue north settles in a man.</w:t>
-      </w:r>
-    </w:p>
-    <w:p/>
-    <w:p/>
-    <w:p/>
-    <w:p>
-      <w:r>
-        <w:t xml:space="preserve"> </w:t>
-      </w:r>
-      <w:proofErr w:type="gramStart"/>
-      <w:r>
-        <w:t>Moved</w:t>
-      </w:r>
-      <w:proofErr w:type="gramEnd"/>
-      <w:r>
-        <w:t xml:space="preserve"> </w:t>
-      </w:r>
-      <w:proofErr w:type="gramStart"/>
-      <w:r>
-        <w:t>a hose</w:t>
-      </w:r>
-      <w:proofErr w:type="gramEnd"/>
-      <w:r>
-        <w:t xml:space="preserve"> to a new connector. Buford disappeared into his shop and </w:t>
-      </w:r>
-      <w:proofErr w:type="gramStart"/>
-      <w:r>
-        <w:t>cam</w:t>
-      </w:r>
-      <w:proofErr w:type="gramEnd"/>
-      <w:r>
-        <w:t xml:space="preserve"> back out with some hose clamps and a roll of duct tape with he</w:t>
-      </w:r>
-      <w:r>
-        <w:t xml:space="preserve"> wrapped furiously and untidily around a </w:t>
-      </w:r>
-      <w:r>
-        <w:t>valve cover.</w:t>
-      </w:r>
-    </w:p>
-    <w:p>
-      <w:r>
-        <w:t xml:space="preserve">              </w:t>
-      </w:r>
-    </w:p>
-    <w:p>
-      <w:r>
-        <w:t>Despite the transformation on the inside, t</w:t>
-      </w:r>
-      <w:r>
-        <w:t>he outside of the shop had not changed. A</w:t>
-      </w:r>
-      <w:r>
-        <w:t>n iconic</w:t>
-      </w:r>
-      <w:r>
-        <w:t xml:space="preserve"> board and batting </w:t>
-      </w:r>
-      <w:r>
-        <w:t xml:space="preserve">weathered </w:t>
-      </w:r>
-      <w:r>
-        <w:t xml:space="preserve">pine barn with a mansard roof. </w:t>
-      </w:r>
-      <w:r>
-        <w:t>A group of visitors</w:t>
-      </w:r>
-      <w:r>
-        <w:t xml:space="preserve"> assembled outside </w:t>
-      </w:r>
-      <w:r>
-        <w:t>the double doors. Among them was Ervine</w:t>
-      </w:r>
-      <w:r>
-        <w:t xml:space="preserve"> </w:t>
-      </w:r>
-      <w:r>
-        <w:t>Carter and with him, men in suits</w:t>
-      </w:r>
-      <w:r>
-        <w:t>. T</w:t>
-      </w:r>
-      <w:r>
-        <w:t xml:space="preserve">he venture capitalists who had fronted the money for </w:t>
-      </w:r>
-      <w:r>
-        <w:t xml:space="preserve">Buford’s production facilities. They had come to </w:t>
-      </w:r>
-      <w:r>
-        <w:t xml:space="preserve">see this </w:t>
-      </w:r>
-      <w:r>
-        <w:t>device</w:t>
-      </w:r>
-      <w:r>
-        <w:t xml:space="preserve">, this </w:t>
-      </w:r>
-      <w:proofErr w:type="spellStart"/>
-      <w:r>
-        <w:t>posthumasly</w:t>
-      </w:r>
-      <w:proofErr w:type="spellEnd"/>
-      <w:r>
-        <w:t xml:space="preserve"> of the </w:t>
-      </w:r>
-      <w:proofErr w:type="spellStart"/>
-      <w:r>
-        <w:t>genious</w:t>
-      </w:r>
-      <w:proofErr w:type="spellEnd"/>
-      <w:r>
-        <w:t xml:space="preserve"> of Horace P. Hooper</w:t>
-      </w:r>
-      <w:r>
-        <w:t>, and to see it in action.</w:t>
-      </w:r>
-    </w:p>
-    <w:p>
-      <w:r>
-        <w:t>The men</w:t>
-      </w:r>
-      <w:r>
-        <w:t xml:space="preserve"> waited. The</w:t>
-      </w:r>
-      <w:r>
-        <w:t xml:space="preserve"> purr of the idling </w:t>
-      </w:r>
-      <w:r>
-        <w:t>F</w:t>
-      </w:r>
-      <w:r>
-        <w:t xml:space="preserve">armall could be heard from inside. The barn doors opened and the </w:t>
-      </w:r>
-      <w:r>
-        <w:t>Farmall rolled out, Buford</w:t>
-      </w:r>
-      <w:r>
-        <w:t xml:space="preserve"> at the wheel.</w:t>
-      </w:r>
-      <w:r>
-        <w:t xml:space="preserve"> Cletus rode on the back</w:t>
-      </w:r>
-      <w:r>
-        <w:t xml:space="preserve">, straddling the side arms of the </w:t>
-      </w:r>
-      <w:proofErr w:type="gramStart"/>
-      <w:r>
-        <w:t>three point</w:t>
-      </w:r>
-      <w:proofErr w:type="gramEnd"/>
-      <w:r>
-        <w:t xml:space="preserve"> hitch and turning a nut on the device with a wrench.</w:t>
-      </w:r>
-    </w:p>
-    <w:p>
-      <w:r>
-        <w:t xml:space="preserve">Except for </w:t>
-      </w:r>
-      <w:r>
-        <w:t>Buford’s original</w:t>
-      </w:r>
-      <w:r>
-        <w:t xml:space="preserve"> peened and primed</w:t>
-      </w:r>
-      <w:r>
-        <w:t xml:space="preserve"> hopper </w:t>
-      </w:r>
-      <w:r>
-        <w:t>and the wood spoked wheels</w:t>
-      </w:r>
-      <w:r>
-        <w:t xml:space="preserve">, this prototype bore little resemblance to the first. </w:t>
-      </w:r>
-      <w:r>
-        <w:t xml:space="preserve">Gone was Buford’s Cadillac engine and in </w:t>
-      </w:r>
-      <w:proofErr w:type="gramStart"/>
-      <w:r>
-        <w:t>it’s</w:t>
-      </w:r>
-      <w:proofErr w:type="gramEnd"/>
-      <w:r>
-        <w:t xml:space="preserve"> place a</w:t>
-      </w:r>
-      <w:r>
-        <w:t>n assemblage of hoses</w:t>
-      </w:r>
-      <w:r>
-        <w:t xml:space="preserve">, actuators and servos </w:t>
-      </w:r>
-      <w:proofErr w:type="gramStart"/>
-      <w:r>
-        <w:t>assemble</w:t>
-      </w:r>
-      <w:proofErr w:type="gramEnd"/>
-      <w:r>
-        <w:t xml:space="preserve"> around a white plastic </w:t>
-      </w:r>
-      <w:r>
-        <w:t>housing</w:t>
-      </w:r>
-      <w:r>
-        <w:t>.</w:t>
-      </w:r>
-    </w:p>
-    <w:p>
-      <w:r>
-        <w:t>“It’s like</w:t>
-      </w:r>
-      <w:r>
-        <w:t xml:space="preserve"> a</w:t>
-      </w:r>
-      <w:r>
-        <w:t xml:space="preserve"> robot escaped from the</w:t>
-      </w:r>
-      <w:r>
-        <w:t xml:space="preserve"> auto</w:t>
-      </w:r>
-      <w:r>
-        <w:t xml:space="preserve"> plant, hid out </w:t>
-      </w:r>
-      <w:r>
-        <w:t>in an ag</w:t>
-      </w:r>
-      <w:r>
-        <w:t xml:space="preserve"> museum, and </w:t>
-      </w:r>
-      <w:r>
-        <w:t xml:space="preserve">mated with a farm implement,” </w:t>
-      </w:r>
-    </w:p>
-    <w:p/>
-    <w:p>
-      <w:r>
-        <w:t>Buford dismounted the tractor, leaving it running. He</w:t>
-      </w:r>
-      <w:r>
-        <w:t xml:space="preserve"> was confident. While testing had, by no means, been exhaustive, he had seen each of the components work just as expected at a modular level and saw no reason for the machine not to perform perfectly all put together – work </w:t>
+        <w:t>Cletus nodded at Buford. Buford</w:t>
+      </w:r>
+      <w:r>
+        <w:t xml:space="preserve"> drew down the throttle and brought the engine up to the </w:t>
+      </w:r>
+      <w:proofErr w:type="spellStart"/>
+      <w:r>
+        <w:t>pto</w:t>
+      </w:r>
+      <w:proofErr w:type="spellEnd"/>
+      <w:r>
+        <w:t xml:space="preserve"> speed of 540 rpms.  </w:t>
       </w:r>
       <w:r>
         <w:t>Cletus</w:t>
       </w:r>
       <w:r>
-        <w:t xml:space="preserve"> was completing</w:t>
-      </w:r>
-      <w:r>
-        <w:t xml:space="preserve"> even now</w:t>
-      </w:r>
-      <w:r>
-        <w:t>.</w:t>
-      </w:r>
-    </w:p>
-    <w:p>
-      <w:r>
-        <w:t xml:space="preserve"> They stood by, casting impatient glances at Ervine Carter while </w:t>
-      </w:r>
-      <w:r>
-        <w:t>Cletus</w:t>
-      </w:r>
-      <w:r>
-        <w:t xml:space="preserve"> tightened bolts fumbled with this or that knob.</w:t>
-      </w:r>
-    </w:p>
-    <w:p>
-      <w:r>
-        <w:t>Cletus nodded at Buford. Buford</w:t>
-      </w:r>
-      <w:r>
-        <w:t xml:space="preserve"> drew down the throttle and brought the engine up to the </w:t>
-      </w:r>
-      <w:proofErr w:type="spellStart"/>
-      <w:r>
-        <w:t>pto</w:t>
-      </w:r>
-      <w:proofErr w:type="spellEnd"/>
-      <w:r>
-        <w:t xml:space="preserve"> speed of 540 rpms.  </w:t>
-      </w:r>
-      <w:r>
-        <w:t>Cletus</w:t>
-      </w:r>
-      <w:r>
         <w:t xml:space="preserve"> pulled a lever on the device itself. It began to whirr and rumble. </w:t>
       </w:r>
     </w:p>
     <w:p/>
     <w:p>
       <w:r>
-        <w:lastRenderedPageBreak/>
         <w:t>Buford smiled. He picked up a bucket and scooped it full of hazelnuts. He poured it into the hopper.</w:t>
       </w:r>
     </w:p>
@@ -3428,6 +3405,7 @@
     <w:p/>
     <w:p>
       <w:r>
+        <w:lastRenderedPageBreak/>
         <w:t xml:space="preserve">Mosey captures </w:t>
       </w:r>
       <w:proofErr w:type="spellStart"/>
@@ -3468,45 +3446,432 @@
     </w:p>
     <w:p>
       <w:r>
+        <w:t>Wes goes to the orchard</w:t>
+      </w:r>
+      <w:r>
+        <w:t xml:space="preserve"> to harvest truffles, but Marnie comes with the hogs and gets them all.</w:t>
+      </w:r>
+    </w:p>
+    <w:p/>
+    <w:p>
+      <w:r>
+        <w:t xml:space="preserve">She </w:t>
+      </w:r>
+      <w:r>
+        <w:t>takes the truffles to her lodge to auction them off.</w:t>
+      </w:r>
+    </w:p>
+    <w:p/>
+    <w:p>
+      <w:r>
+        <w:t xml:space="preserve">The family finds out they’ve been </w:t>
+      </w:r>
+      <w:proofErr w:type="spellStart"/>
+      <w:r>
+        <w:t>forecloseds</w:t>
+      </w:r>
+      <w:proofErr w:type="spellEnd"/>
+      <w:r>
+        <w:t xml:space="preserve"> upon.</w:t>
+      </w:r>
+    </w:p>
+    <w:p>
+      <w:r>
+        <w:t>Wess spills the beans about the truffles. They confront Marnie. Her husband has left her and taken with him all the truffles. She doesn’t know where they are.</w:t>
+      </w:r>
+    </w:p>
+    <w:p/>
+    <w:p>
+      <w:r>
+        <w:t xml:space="preserve">The family recovers the truffles but </w:t>
+      </w:r>
+      <w:proofErr w:type="spellStart"/>
+      <w:r>
+        <w:t>Druallissa</w:t>
+      </w:r>
+      <w:proofErr w:type="spellEnd"/>
+      <w:r>
+        <w:t xml:space="preserve">, in a fit of </w:t>
+      </w:r>
+      <w:proofErr w:type="spellStart"/>
+      <w:r>
+        <w:t>peake</w:t>
+      </w:r>
+      <w:proofErr w:type="spellEnd"/>
+      <w:r>
+        <w:t>, summons the starlings to destroy them.</w:t>
+      </w:r>
+    </w:p>
+    <w:p/>
+    <w:p>
+      <w:r>
+        <w:t>The resolve to make the redemption device work in time for another demonstration. They devise a ruse</w:t>
+      </w:r>
+      <w:r>
+        <w:t xml:space="preserve"> using the jars of Praline butter. Beauregard’s Christmas arm is very useful for this. Cletus and Buford modify the device to </w:t>
+      </w:r>
+      <w:r>
+        <w:t>emit the chocolate hazelnut spread.</w:t>
+      </w:r>
+    </w:p>
+    <w:p>
+      <w:r>
+        <w:t xml:space="preserve">The ruse is a success. </w:t>
+      </w:r>
+      <w:r>
+        <w:t xml:space="preserve">Buford leverages is using the fact that he knows </w:t>
+      </w:r>
+      <w:proofErr w:type="spellStart"/>
+      <w:r>
+        <w:t>Evine</w:t>
+      </w:r>
+      <w:proofErr w:type="spellEnd"/>
+      <w:r>
+        <w:t xml:space="preserve"> Carter knows his poker tell but </w:t>
+      </w:r>
+      <w:r>
+        <w:t>doesn’t know Buford knows.</w:t>
+      </w:r>
+    </w:p>
+    <w:p/>
+    <w:p>
+      <w:r>
+        <w:t xml:space="preserve">Much of that next </w:t>
+      </w:r>
+      <w:proofErr w:type="gramStart"/>
+      <w:r>
+        <w:t>years</w:t>
+      </w:r>
+      <w:proofErr w:type="gramEnd"/>
+      <w:r>
+        <w:t xml:space="preserve"> truffle crop went to </w:t>
+      </w:r>
+      <w:proofErr w:type="spellStart"/>
+      <w:r>
+        <w:t>attonery</w:t>
+      </w:r>
+      <w:proofErr w:type="spellEnd"/>
+      <w:r>
+        <w:t xml:space="preserve"> fees over Ervine Carter’s fraud suit. In the end, he ended up being happy with his purchase. He got two patents that became the bases for a chipper/smoker and Mr. Peanut butter.</w:t>
+      </w:r>
+    </w:p>
+    <w:p/>
+    <w:p/>
+    <w:p/>
+    <w:p/>
+    <w:p/>
+    <w:p/>
+    <w:p/>
+    <w:p/>
+    <w:p>
+      <w:r>
+        <w:t xml:space="preserve">Buford is saved. </w:t>
+      </w:r>
+      <w:proofErr w:type="spellStart"/>
+      <w:r>
+        <w:t>Drualissa</w:t>
+      </w:r>
+      <w:proofErr w:type="spellEnd"/>
+      <w:r>
+        <w:t xml:space="preserve"> is driven off</w:t>
+      </w:r>
+      <w:r>
+        <w:t xml:space="preserve">. Blind Manie’s sight is restored but she </w:t>
+      </w:r>
+      <w:proofErr w:type="gramStart"/>
+      <w:r>
+        <w:t>looses</w:t>
+      </w:r>
+      <w:proofErr w:type="gramEnd"/>
+      <w:r>
+        <w:t xml:space="preserve"> her sway over the </w:t>
+      </w:r>
+      <w:r>
+        <w:t xml:space="preserve">animals. The farm is scheduled to </w:t>
+      </w:r>
+      <w:proofErr w:type="gramStart"/>
+      <w:r>
+        <w:t>be</w:t>
+      </w:r>
+      <w:proofErr w:type="gramEnd"/>
+      <w:r>
+        <w:t xml:space="preserve"> </w:t>
+      </w:r>
+      <w:proofErr w:type="gramStart"/>
+      <w:r>
+        <w:t>auctions</w:t>
+      </w:r>
+      <w:proofErr w:type="gramEnd"/>
+      <w:r>
+        <w:t>.</w:t>
+      </w:r>
+    </w:p>
+    <w:p>
+      <w:r>
         <w:lastRenderedPageBreak/>
-        <w:t>Wes goes to the orchard</w:t>
-      </w:r>
-      <w:r>
-        <w:t xml:space="preserve"> to harvest truffles, but Marnie comes with the hogs and gets them all.</w:t>
-      </w:r>
-    </w:p>
-    <w:p/>
-    <w:p>
-      <w:r>
         <w:t xml:space="preserve">She </w:t>
       </w:r>
-      <w:r>
-        <w:t>takes the truffles to her lodge to auction them off.</w:t>
-      </w:r>
-    </w:p>
-    <w:p/>
-    <w:p>
-      <w:r>
-        <w:t xml:space="preserve">The family finds out they’ve been </w:t>
-      </w:r>
-      <w:proofErr w:type="spellStart"/>
-      <w:r>
-        <w:t>forecloseds</w:t>
-      </w:r>
-      <w:proofErr w:type="spellEnd"/>
-      <w:r>
-        <w:t xml:space="preserve"> upon.</w:t>
-      </w:r>
-    </w:p>
-    <w:p>
-      <w:r>
-        <w:t>Wess spills the beans about the truffles. They confront Marnie. Her husband has left her and taken with him all the truffles. She doesn’t know where they are.</w:t>
-      </w:r>
-    </w:p>
-    <w:p/>
-    <w:p>
-      <w:r>
-        <w:t xml:space="preserve">The family recovers the truffles but </w:t>
+      <w:proofErr w:type="spellStart"/>
+      <w:r>
+        <w:t>casn’t</w:t>
+      </w:r>
+      <w:proofErr w:type="spellEnd"/>
+      <w:r>
+        <w:t xml:space="preserve"> go down there now. And find the truffles. No. </w:t>
+      </w:r>
+    </w:p>
+    <w:p>
+      <w:r>
+        <w:t xml:space="preserve">I need to know about Blind Marnie. Or maybe I need to </w:t>
+      </w:r>
+      <w:proofErr w:type="spellStart"/>
+      <w:proofErr w:type="gramStart"/>
+      <w:r>
+        <w:t>now</w:t>
+      </w:r>
+      <w:proofErr w:type="spellEnd"/>
+      <w:proofErr w:type="gramEnd"/>
+      <w:r>
+        <w:t xml:space="preserve"> about Ervine Carter.</w:t>
+      </w:r>
+    </w:p>
+    <w:p>
+      <w:r>
+        <w:t>Are they a couple? Yes!</w:t>
+      </w:r>
+    </w:p>
+    <w:p>
+      <w:r>
+        <w:t xml:space="preserve">Maybe they have a </w:t>
+      </w:r>
+      <w:proofErr w:type="gramStart"/>
+      <w:r>
+        <w:t>break up</w:t>
+      </w:r>
+      <w:proofErr w:type="gramEnd"/>
+      <w:r>
+        <w:t xml:space="preserve">. </w:t>
+      </w:r>
+      <w:r>
+        <w:t>Maybe they don’t.</w:t>
+      </w:r>
+    </w:p>
+    <w:p>
+      <w:r>
+        <w:t>Maybe Wess does go to DCS.</w:t>
+      </w:r>
+    </w:p>
+    <w:p>
+      <w:r>
+        <w:t>Maybe the snipe hunt.</w:t>
+      </w:r>
+    </w:p>
+    <w:p>
+      <w:r>
+        <w:t>‘</w:t>
+      </w:r>
+      <w:r>
+        <w:t xml:space="preserve">How do I get to a snipe hunt with </w:t>
+      </w:r>
+      <w:proofErr w:type="gramStart"/>
+      <w:r>
+        <w:t>the wild</w:t>
+      </w:r>
+      <w:proofErr w:type="gramEnd"/>
+      <w:r>
+        <w:t xml:space="preserve"> hogs?</w:t>
+      </w:r>
+    </w:p>
+    <w:p/>
+    <w:p>
+      <w:r>
+        <w:t>“Wesley to Blind Marnie:</w:t>
+      </w:r>
+    </w:p>
+    <w:p>
+      <w:r>
+        <w:t xml:space="preserve">I just </w:t>
+      </w:r>
+      <w:proofErr w:type="gramStart"/>
+      <w:r>
+        <w:t>have to</w:t>
+      </w:r>
+      <w:proofErr w:type="gramEnd"/>
+      <w:r>
+        <w:t xml:space="preserve"> bring the Wild Hogs in here and they’ll </w:t>
+      </w:r>
+      <w:r>
+        <w:t xml:space="preserve">trash this place and eat all the truffles There won’t be one of them left for you to sell to </w:t>
+      </w:r>
+      <w:r>
+        <w:t>Ervine Cater and he won’t *. Then you won’t be able to buy the farm either.”</w:t>
+      </w:r>
+      <w:r>
+        <w:br/>
+      </w:r>
+    </w:p>
+    <w:p>
+      <w:r>
+        <w:t>Bring the hogs here? You’re no conjurer</w:t>
+      </w:r>
+      <w:r>
+        <w:t>.”</w:t>
+      </w:r>
+    </w:p>
+    <w:p>
+      <w:r>
+        <w:t xml:space="preserve">Marnie plans on paying the </w:t>
+      </w:r>
+      <w:proofErr w:type="gramStart"/>
+      <w:r>
+        <w:t>note, and</w:t>
+      </w:r>
+      <w:proofErr w:type="gramEnd"/>
+      <w:r>
+        <w:t xml:space="preserve"> keeping </w:t>
+      </w:r>
+      <w:proofErr w:type="gramStart"/>
+      <w:r>
+        <w:t>he</w:t>
+      </w:r>
+      <w:proofErr w:type="gramEnd"/>
+      <w:r>
+        <w:t xml:space="preserve"> farm for herself.</w:t>
+      </w:r>
+    </w:p>
+    <w:p>
+      <w:r>
+        <w:t>Buford needs Ervine Carter to think he’s lying</w:t>
+      </w:r>
+      <w:r>
+        <w:t xml:space="preserve">. He’s </w:t>
+      </w:r>
+      <w:proofErr w:type="gramStart"/>
+      <w:r>
+        <w:t>really not</w:t>
+      </w:r>
+      <w:proofErr w:type="gramEnd"/>
+      <w:r>
+        <w:t>.</w:t>
+      </w:r>
+    </w:p>
+    <w:p>
+      <w:r>
+        <w:t xml:space="preserve">He wants Ervine Carter to believe </w:t>
+      </w:r>
+      <w:proofErr w:type="gramStart"/>
+      <w:r>
+        <w:t>something</w:t>
+      </w:r>
+      <w:proofErr w:type="gramEnd"/>
+      <w:r>
+        <w:t xml:space="preserve"> so he tells him the opposite and bats </w:t>
+      </w:r>
+      <w:proofErr w:type="gramStart"/>
+      <w:r>
+        <w:t>at</w:t>
+      </w:r>
+      <w:proofErr w:type="gramEnd"/>
+      <w:r>
+        <w:t xml:space="preserve"> his vest pocket</w:t>
+      </w:r>
+      <w:r>
+        <w:t xml:space="preserve">. </w:t>
+      </w:r>
+      <w:r>
+        <w:t>That something causes Ervine Carter to take some action that costs him his interest in the farm.</w:t>
+      </w:r>
+    </w:p>
+    <w:p/>
+    <w:p/>
+    <w:p/>
+    <w:p/>
+    <w:p/>
+    <w:p/>
+    <w:p/>
+    <w:p/>
+    <w:p/>
+    <w:p/>
+    <w:p/>
+    <w:p/>
+    <w:p>
+      <w:r>
+        <w:lastRenderedPageBreak/>
+        <w:t>Help me! Help me!</w:t>
+      </w:r>
+    </w:p>
+    <w:p/>
+    <w:p/>
+    <w:p>
+      <w:r>
+        <w:t>Wesley</w:t>
+      </w:r>
+    </w:p>
+    <w:p/>
+    <w:p/>
+    <w:p/>
+    <w:p/>
+    <w:p/>
+    <w:p/>
+    <w:p/>
+    <w:p/>
+    <w:p>
+      <w:r>
+        <w:t xml:space="preserve">I </w:t>
+      </w:r>
+      <w:proofErr w:type="spellStart"/>
+      <w:r>
+        <w:t>gotta</w:t>
+      </w:r>
+      <w:proofErr w:type="spellEnd"/>
+      <w:r>
+        <w:t xml:space="preserve"> get Bufford squeezed by </w:t>
+      </w:r>
+      <w:proofErr w:type="spellStart"/>
+      <w:r>
+        <w:t>Drualissa</w:t>
+      </w:r>
+      <w:proofErr w:type="spellEnd"/>
+      <w:r>
+        <w:t xml:space="preserve"> before I conclude this thing. How do I do that?</w:t>
+      </w:r>
+    </w:p>
+    <w:p>
+      <w:proofErr w:type="spellStart"/>
+      <w:r>
+        <w:t>Drualissa</w:t>
+      </w:r>
+      <w:proofErr w:type="spellEnd"/>
+      <w:r>
+        <w:t xml:space="preserve"> comes to the shop? Why? Blind Marnie sends </w:t>
+      </w:r>
+      <w:proofErr w:type="spellStart"/>
+      <w:proofErr w:type="gramStart"/>
+      <w:r>
+        <w:t>her.Why</w:t>
+      </w:r>
+      <w:proofErr w:type="spellEnd"/>
+      <w:proofErr w:type="gramEnd"/>
+      <w:r>
+        <w:t>?</w:t>
+      </w:r>
+    </w:p>
+    <w:p>
+      <w:r>
+        <w:t xml:space="preserve">Buford would be back in the shop after this. Modifying the device. Would Blind Marnie </w:t>
+      </w:r>
+      <w:proofErr w:type="spellStart"/>
+      <w:r>
+        <w:t>wanna</w:t>
+      </w:r>
+      <w:proofErr w:type="spellEnd"/>
+      <w:r>
+        <w:t xml:space="preserve"> stop him?</w:t>
+      </w:r>
+    </w:p>
+    <w:p>
+      <w:r>
+        <w:t xml:space="preserve">Would </w:t>
       </w:r>
       <w:proofErr w:type="spellStart"/>
       <w:r>
@@ -3514,81 +3879,34 @@
       </w:r>
       <w:proofErr w:type="spellEnd"/>
       <w:r>
-        <w:t xml:space="preserve">, in a fit of </w:t>
-      </w:r>
-      <w:proofErr w:type="spellStart"/>
-      <w:r>
-        <w:t>peake</w:t>
-      </w:r>
-      <w:proofErr w:type="spellEnd"/>
-      <w:r>
-        <w:t>, summons the starlings to destroy them.</w:t>
-      </w:r>
-    </w:p>
-    <w:p/>
-    <w:p>
-      <w:r>
-        <w:t>The resolve to make the redemption device work in time for another demonstration. They devise a ruse</w:t>
-      </w:r>
-      <w:r>
-        <w:t xml:space="preserve"> using the jars of Praline butter. Beauregard’s Christmas arm is very useful for this. Cletus and Buford modify the device to </w:t>
-      </w:r>
-      <w:r>
-        <w:t>emit the chocolate hazelnut spread.</w:t>
-      </w:r>
-    </w:p>
-    <w:p>
-      <w:r>
-        <w:t xml:space="preserve">The ruse is a success. </w:t>
-      </w:r>
-      <w:r>
-        <w:t xml:space="preserve">Buford leverages is using the fact that he knows </w:t>
-      </w:r>
-      <w:proofErr w:type="spellStart"/>
-      <w:r>
-        <w:t>Evine</w:t>
-      </w:r>
-      <w:proofErr w:type="spellEnd"/>
-      <w:r>
-        <w:t xml:space="preserve"> Carter knows his poker tell but </w:t>
-      </w:r>
-      <w:r>
-        <w:t>doesn’t know Buford knows.</w:t>
-      </w:r>
-    </w:p>
-    <w:p/>
-    <w:p>
-      <w:r>
-        <w:t xml:space="preserve">Much of that next </w:t>
-      </w:r>
-      <w:proofErr w:type="gramStart"/>
-      <w:r>
-        <w:t>years</w:t>
-      </w:r>
-      <w:proofErr w:type="gramEnd"/>
-      <w:r>
-        <w:t xml:space="preserve"> truffle crop went to </w:t>
-      </w:r>
-      <w:proofErr w:type="spellStart"/>
-      <w:r>
-        <w:t>attonery</w:t>
-      </w:r>
-      <w:proofErr w:type="spellEnd"/>
-      <w:r>
-        <w:t xml:space="preserve"> fees over Ervine Carter’s fraud suit. In the end, he ended up being happy with his purchase. He got two patents that became the bases for a chipper/smoker and Mr. Peanut butter.</w:t>
-      </w:r>
-    </w:p>
-    <w:p/>
-    <w:p/>
-    <w:p/>
-    <w:p/>
-    <w:p/>
-    <w:p/>
-    <w:p/>
-    <w:p/>
-    <w:p>
-      <w:r>
-        <w:t xml:space="preserve">Buford is saved. </w:t>
+        <w:t xml:space="preserve"> hide in the shop? How do I get to </w:t>
+      </w:r>
+      <w:proofErr w:type="spellStart"/>
+      <w:r>
+        <w:t>Moseay</w:t>
+      </w:r>
+      <w:proofErr w:type="spellEnd"/>
+      <w:r>
+        <w:t xml:space="preserve"> saving him on the </w:t>
+      </w:r>
+      <w:proofErr w:type="spellStart"/>
+      <w:r>
+        <w:t>farmall</w:t>
+      </w:r>
+      <w:proofErr w:type="spellEnd"/>
+      <w:r>
+        <w:t>?</w:t>
+      </w:r>
+    </w:p>
+    <w:p/>
+    <w:p>
+      <w:r>
+        <w:t>Do I need another building? The pole barn would be a good place for a snake.</w:t>
+      </w:r>
+    </w:p>
+    <w:p>
+      <w:r>
+        <w:t xml:space="preserve">I could end it here, with </w:t>
       </w:r>
       <w:proofErr w:type="spellStart"/>
       <w:r>
@@ -3596,33 +3914,165 @@
       </w:r>
       <w:proofErr w:type="spellEnd"/>
       <w:r>
-        <w:t xml:space="preserve"> is driven off</w:t>
-      </w:r>
-      <w:r>
-        <w:t xml:space="preserve">. Blind Manie’s sight is restored but she </w:t>
-      </w:r>
-      <w:proofErr w:type="gramStart"/>
-      <w:r>
-        <w:t>looses</w:t>
-      </w:r>
-      <w:proofErr w:type="gramEnd"/>
-      <w:r>
-        <w:t xml:space="preserve"> her sway over the </w:t>
-      </w:r>
-      <w:r>
-        <w:t xml:space="preserve">animals. The farm is scheduled to </w:t>
-      </w:r>
-      <w:proofErr w:type="gramStart"/>
-      <w:r>
-        <w:t>be</w:t>
-      </w:r>
-      <w:proofErr w:type="gramEnd"/>
+        <w:t xml:space="preserve"> arriving on the </w:t>
+      </w:r>
+      <w:proofErr w:type="gramStart"/>
+      <w:r>
+        <w:t>scene</w:t>
+      </w:r>
+      <w:proofErr w:type="gramEnd"/>
+      <w:r>
+        <w:t>.</w:t>
+      </w:r>
+    </w:p>
+    <w:p>
+      <w:r>
+        <w:t xml:space="preserve">Something </w:t>
+      </w:r>
+      <w:proofErr w:type="gramStart"/>
+      <w:r>
+        <w:t>going</w:t>
+      </w:r>
+      <w:proofErr w:type="gramEnd"/>
+      <w:r>
+        <w:t xml:space="preserve"> on with the animals. </w:t>
+      </w:r>
+      <w:r>
+        <w:t>That’s what I had in mind all along. The animals are drawing her out to kill h</w:t>
+      </w:r>
+      <w:r>
+        <w:t xml:space="preserve">er. How? Whatever </w:t>
+      </w:r>
+      <w:proofErr w:type="gramStart"/>
+      <w:r>
+        <w:t>it is</w:t>
+      </w:r>
+      <w:proofErr w:type="gramEnd"/>
+      <w:r>
+        <w:t xml:space="preserve"> fails. Probably because Buford broke something they needed with his device.</w:t>
+      </w:r>
+    </w:p>
+    <w:p>
+      <w:r>
+        <w:t xml:space="preserve">Something’s going on with the animals and </w:t>
+      </w:r>
+      <w:proofErr w:type="spellStart"/>
+      <w:r>
+        <w:t>Drualissa</w:t>
+      </w:r>
+      <w:proofErr w:type="spellEnd"/>
+      <w:r>
+        <w:t xml:space="preserve"> in the orchard while this is taking place, </w:t>
+      </w:r>
+      <w:proofErr w:type="gramStart"/>
+      <w:r>
+        <w:t>It’s</w:t>
+      </w:r>
+      <w:proofErr w:type="gramEnd"/>
+      <w:r>
+        <w:t xml:space="preserve"> almost successful, but it’s disrupted by a </w:t>
+      </w:r>
+      <w:r>
+        <w:t>flying hazelnut. Maybe they intend to turn the stacked pallets of hazelnuts over on her.</w:t>
+      </w:r>
+    </w:p>
+    <w:p>
+      <w:r>
+        <w:t xml:space="preserve">How would they </w:t>
+      </w:r>
+      <w:r>
+        <w:t xml:space="preserve">do that? </w:t>
+      </w:r>
+    </w:p>
+    <w:p>
+      <w:r>
+        <w:t>Something to do with the civil war?</w:t>
+      </w:r>
+    </w:p>
+    <w:p>
+      <w:r>
+        <w:t>Capture her.</w:t>
+      </w:r>
+    </w:p>
+    <w:p>
+      <w:r>
+        <w:t>Why would they need to capture her. With a net. Dropped from the pallet of coconuts.</w:t>
+      </w:r>
+    </w:p>
+    <w:p>
+      <w:r>
+        <w:t xml:space="preserve">What would you do with a </w:t>
+      </w:r>
+      <w:r>
+        <w:t>captured boa?</w:t>
+      </w:r>
+    </w:p>
+    <w:p>
+      <w:r>
+        <w:lastRenderedPageBreak/>
+        <w:t>Where would they get a net?</w:t>
+      </w:r>
+    </w:p>
+    <w:p>
+      <w:r>
+        <w:t xml:space="preserve">Covered in </w:t>
+      </w:r>
+      <w:proofErr w:type="spellStart"/>
+      <w:r>
+        <w:t>Prailene</w:t>
+      </w:r>
+      <w:proofErr w:type="spellEnd"/>
+      <w:r>
+        <w:t xml:space="preserve"> Butter.</w:t>
+      </w:r>
+    </w:p>
+    <w:p>
+      <w:r>
+        <w:t>Live specimen.</w:t>
+      </w:r>
+    </w:p>
+    <w:p>
+      <w:r>
+        <w:t>Maybe just continue the story.</w:t>
+      </w:r>
       <w:r>
         <w:t xml:space="preserve"> </w:t>
       </w:r>
-      <w:proofErr w:type="gramStart"/>
-      <w:r>
-        <w:t>auctions</w:t>
+      <w:proofErr w:type="spellStart"/>
+      <w:r>
+        <w:t>Mabye</w:t>
+      </w:r>
+      <w:proofErr w:type="spellEnd"/>
+      <w:r>
+        <w:t xml:space="preserve"> there’s some spell you can cast. Maybe they need information from her.</w:t>
+      </w:r>
+    </w:p>
+    <w:p>
+      <w:proofErr w:type="spellStart"/>
+      <w:r>
+        <w:t>Druallissa</w:t>
+      </w:r>
+      <w:proofErr w:type="spellEnd"/>
+      <w:r>
+        <w:t xml:space="preserve"> knows something!</w:t>
+      </w:r>
+      <w:r>
+        <w:t xml:space="preserve"> Where </w:t>
+      </w:r>
+      <w:proofErr w:type="gramStart"/>
+      <w:r>
+        <w:t>the truffles are</w:t>
+      </w:r>
+      <w:proofErr w:type="gramEnd"/>
+      <w:r>
+        <w:t>? The dogs should be able to smell them.</w:t>
+      </w:r>
+      <w:r>
+        <w:t xml:space="preserve"> </w:t>
+      </w:r>
+      <w:proofErr w:type="gramStart"/>
+      <w:r>
+        <w:t>There’s  cave</w:t>
       </w:r>
       <w:proofErr w:type="gramEnd"/>
       <w:r>
@@ -3631,568 +4081,96 @@
     </w:p>
     <w:p>
       <w:r>
-        <w:t xml:space="preserve">She </w:t>
-      </w:r>
-      <w:proofErr w:type="spellStart"/>
-      <w:r>
-        <w:t>casn’t</w:t>
-      </w:r>
-      <w:proofErr w:type="spellEnd"/>
-      <w:r>
-        <w:t xml:space="preserve"> go down there now. And find the truffles. No. </w:t>
-      </w:r>
-    </w:p>
-    <w:p>
-      <w:r>
-        <w:t xml:space="preserve">I need to know about Blind Marnie. Or maybe I need to </w:t>
-      </w:r>
-      <w:proofErr w:type="spellStart"/>
-      <w:proofErr w:type="gramStart"/>
-      <w:r>
-        <w:t>now</w:t>
-      </w:r>
-      <w:proofErr w:type="spellEnd"/>
-      <w:proofErr w:type="gramEnd"/>
-      <w:r>
-        <w:t xml:space="preserve"> about Ervine Carter.</w:t>
-      </w:r>
-    </w:p>
-    <w:p>
-      <w:r>
-        <w:lastRenderedPageBreak/>
-        <w:t>Are they a couple? Yes!</w:t>
-      </w:r>
-    </w:p>
-    <w:p>
-      <w:r>
-        <w:t xml:space="preserve">Maybe they have a </w:t>
-      </w:r>
-      <w:proofErr w:type="gramStart"/>
-      <w:r>
-        <w:t>break up</w:t>
-      </w:r>
-      <w:proofErr w:type="gramEnd"/>
-      <w:r>
-        <w:t xml:space="preserve">. </w:t>
-      </w:r>
-      <w:r>
-        <w:t>Maybe they don’t.</w:t>
-      </w:r>
-    </w:p>
-    <w:p>
-      <w:r>
-        <w:t>Maybe Wess does go to DCS.</w:t>
-      </w:r>
-    </w:p>
-    <w:p>
-      <w:r>
-        <w:t>Maybe the snipe hunt.</w:t>
-      </w:r>
-    </w:p>
-    <w:p>
-      <w:r>
-        <w:t>‘</w:t>
-      </w:r>
-      <w:r>
-        <w:t xml:space="preserve">How do I get to a snipe hunt with </w:t>
-      </w:r>
-      <w:proofErr w:type="gramStart"/>
-      <w:r>
-        <w:t>the wild</w:t>
-      </w:r>
-      <w:proofErr w:type="gramEnd"/>
-      <w:r>
-        <w:t xml:space="preserve"> hogs?</w:t>
-      </w:r>
-    </w:p>
-    <w:p/>
-    <w:p>
-      <w:r>
-        <w:t>“Wesley to Blind Marnie:</w:t>
-      </w:r>
-    </w:p>
-    <w:p>
-      <w:r>
-        <w:t xml:space="preserve">I just </w:t>
-      </w:r>
-      <w:proofErr w:type="gramStart"/>
-      <w:r>
-        <w:t>have to</w:t>
-      </w:r>
-      <w:proofErr w:type="gramEnd"/>
-      <w:r>
-        <w:t xml:space="preserve"> bring the Wild Hogs in here and they’ll </w:t>
-      </w:r>
-      <w:r>
-        <w:t xml:space="preserve">trash this place and eat all the truffles There won’t be one of them left for you to sell to </w:t>
-      </w:r>
-      <w:r>
-        <w:t>Ervine Cater and he won’t *. Then you won’t be able to buy the farm either.”</w:t>
-      </w:r>
-      <w:r>
-        <w:br/>
-      </w:r>
-    </w:p>
-    <w:p>
-      <w:r>
-        <w:t>Bring the hogs here? You’re no conjurer</w:t>
-      </w:r>
-      <w:r>
-        <w:t>.”</w:t>
-      </w:r>
-    </w:p>
-    <w:p>
-      <w:r>
-        <w:t xml:space="preserve">Marnie plans on paying the </w:t>
-      </w:r>
-      <w:proofErr w:type="gramStart"/>
-      <w:r>
-        <w:t>note, and</w:t>
-      </w:r>
-      <w:proofErr w:type="gramEnd"/>
-      <w:r>
-        <w:t xml:space="preserve"> keeping </w:t>
-      </w:r>
-      <w:proofErr w:type="gramStart"/>
-      <w:r>
-        <w:t>he</w:t>
-      </w:r>
-      <w:proofErr w:type="gramEnd"/>
-      <w:r>
-        <w:t xml:space="preserve"> farm for herself.</w:t>
-      </w:r>
-    </w:p>
-    <w:p>
-      <w:r>
-        <w:t>Buford needs Ervine Carter to think he’s lying</w:t>
-      </w:r>
-      <w:r>
-        <w:t xml:space="preserve">. He’s </w:t>
-      </w:r>
-      <w:proofErr w:type="gramStart"/>
-      <w:r>
-        <w:t>really not</w:t>
-      </w:r>
-      <w:proofErr w:type="gramEnd"/>
-      <w:r>
-        <w:t>.</w:t>
-      </w:r>
-    </w:p>
-    <w:p>
-      <w:r>
-        <w:t xml:space="preserve">He wants Ervine Carter to believe </w:t>
-      </w:r>
-      <w:proofErr w:type="gramStart"/>
-      <w:r>
-        <w:t>something</w:t>
-      </w:r>
-      <w:proofErr w:type="gramEnd"/>
-      <w:r>
-        <w:t xml:space="preserve"> so he tells him the opposite and bats </w:t>
-      </w:r>
-      <w:proofErr w:type="gramStart"/>
-      <w:r>
-        <w:t>at</w:t>
-      </w:r>
-      <w:proofErr w:type="gramEnd"/>
-      <w:r>
-        <w:t xml:space="preserve"> his vest pocket</w:t>
-      </w:r>
-      <w:r>
-        <w:t xml:space="preserve">. </w:t>
-      </w:r>
-      <w:r>
-        <w:t>That something causes Ervine Carter to take some action that costs him his interest in the farm.</w:t>
-      </w:r>
-    </w:p>
-    <w:p/>
-    <w:p/>
-    <w:p/>
-    <w:p/>
-    <w:p/>
-    <w:p/>
-    <w:p/>
-    <w:p/>
-    <w:p/>
-    <w:p/>
-    <w:p/>
-    <w:p/>
-    <w:p>
-      <w:r>
-        <w:t>Help me! Help me!</w:t>
-      </w:r>
-    </w:p>
-    <w:p/>
-    <w:p/>
-    <w:p>
-      <w:r>
-        <w:t>Wesley</w:t>
-      </w:r>
-    </w:p>
-    <w:p/>
-    <w:p/>
-    <w:p/>
-    <w:p/>
-    <w:p/>
-    <w:p/>
-    <w:p/>
-    <w:p/>
-    <w:p>
-      <w:r>
-        <w:t xml:space="preserve">I </w:t>
-      </w:r>
-      <w:proofErr w:type="spellStart"/>
-      <w:r>
-        <w:t>gotta</w:t>
-      </w:r>
-      <w:proofErr w:type="spellEnd"/>
-      <w:r>
-        <w:t xml:space="preserve"> get Bufford squeezed by </w:t>
-      </w:r>
-      <w:proofErr w:type="spellStart"/>
-      <w:r>
-        <w:t>Drualissa</w:t>
-      </w:r>
-      <w:proofErr w:type="spellEnd"/>
-      <w:r>
-        <w:t xml:space="preserve"> before I conclude this thing. How do I do that?</w:t>
-      </w:r>
-    </w:p>
-    <w:p>
-      <w:proofErr w:type="spellStart"/>
-      <w:r>
-        <w:t>Drualissa</w:t>
-      </w:r>
-      <w:proofErr w:type="spellEnd"/>
-      <w:r>
-        <w:t xml:space="preserve"> comes to the shop? Why? Blind Marnie sends </w:t>
-      </w:r>
-      <w:proofErr w:type="spellStart"/>
-      <w:proofErr w:type="gramStart"/>
-      <w:r>
-        <w:t>her.Why</w:t>
-      </w:r>
-      <w:proofErr w:type="spellEnd"/>
-      <w:proofErr w:type="gramEnd"/>
+        <w:t xml:space="preserve">They need a net. Where will they get one? </w:t>
+      </w:r>
+    </w:p>
+    <w:p>
+      <w:r>
+        <w:t>Buford goes into the orchard and discovers a truffle. That’s why the snake gets him</w:t>
+      </w:r>
+      <w:r>
+        <w:t>. Or he stumbles upon Blind Marnie’s truffle hoard.</w:t>
+      </w:r>
+    </w:p>
+    <w:p/>
+    <w:p>
+      <w:r>
+        <w:t xml:space="preserve">Or he just really pisses Blind Marnie off. </w:t>
+      </w:r>
+    </w:p>
+    <w:p/>
+    <w:p>
+      <w:r>
+        <w:t xml:space="preserve">Blind Marnie has hatched something. Wes </w:t>
+      </w:r>
+      <w:proofErr w:type="gramStart"/>
+      <w:r>
+        <w:t>has hatched</w:t>
+      </w:r>
+      <w:proofErr w:type="gramEnd"/>
+      <w:r>
+        <w:t xml:space="preserve"> something to stop it. </w:t>
+      </w:r>
+    </w:p>
+    <w:p/>
+    <w:p>
+      <w:r>
+        <w:t xml:space="preserve">All this just to get Buford squeezed by a </w:t>
+      </w:r>
+      <w:proofErr w:type="gramStart"/>
+      <w:r>
+        <w:t>snake</w:t>
+      </w:r>
       <w:r>
         <w:t>?</w:t>
       </w:r>
-    </w:p>
-    <w:p>
-      <w:r>
-        <w:t xml:space="preserve">Buford would be back in the shop after this. Modifying the device. Would Blind Marnie </w:t>
-      </w:r>
-      <w:proofErr w:type="spellStart"/>
-      <w:r>
-        <w:t>wanna</w:t>
-      </w:r>
-      <w:proofErr w:type="spellEnd"/>
-      <w:r>
-        <w:t xml:space="preserve"> stop him?</w:t>
-      </w:r>
-    </w:p>
-    <w:p>
-      <w:r>
-        <w:t xml:space="preserve">Would </w:t>
-      </w:r>
-      <w:proofErr w:type="spellStart"/>
-      <w:r>
-        <w:t>Druallissa</w:t>
-      </w:r>
-      <w:proofErr w:type="spellEnd"/>
-      <w:r>
-        <w:t xml:space="preserve"> hide in the shop? How do I get to </w:t>
-      </w:r>
-      <w:proofErr w:type="spellStart"/>
-      <w:r>
-        <w:t>Moseay</w:t>
-      </w:r>
-      <w:proofErr w:type="spellEnd"/>
-      <w:r>
-        <w:t xml:space="preserve"> saving him on the </w:t>
-      </w:r>
-      <w:proofErr w:type="spellStart"/>
-      <w:r>
-        <w:t>farmall</w:t>
-      </w:r>
-      <w:proofErr w:type="spellEnd"/>
+      <w:proofErr w:type="gramEnd"/>
+      <w:r>
+        <w:t xml:space="preserve"> Maybe squeeze Wes Sooner.</w:t>
+      </w:r>
+    </w:p>
+    <w:p>
+      <w:r>
+        <w:t>Shit. I’m just now to the muddled middle.</w:t>
+      </w:r>
+    </w:p>
+    <w:p/>
+    <w:p>
+      <w:r>
+        <w:t>Muddled middle ends with Buford squeezed by the snake</w:t>
+      </w:r>
+      <w:r>
+        <w:t>, Mosey saving him.</w:t>
+      </w:r>
+    </w:p>
+    <w:p/>
+    <w:p>
+      <w:r>
+        <w:t>What about Blind Marnie</w:t>
+      </w:r>
+      <w:r>
+        <w:t xml:space="preserve"> </w:t>
+      </w:r>
+      <w:proofErr w:type="spellStart"/>
+      <w:proofErr w:type="gramStart"/>
+      <w:r>
+        <w:t>gatheringin</w:t>
+      </w:r>
+      <w:proofErr w:type="spellEnd"/>
+      <w:proofErr w:type="gramEnd"/>
+      <w:r>
+        <w:t xml:space="preserve"> the truffles. We haven’t even seen the wild hogs yet. </w:t>
+      </w:r>
+      <w:r>
+        <w:t>She goes with them one night in the fall. Find out when the truffles are ready and write that.</w:t>
+      </w:r>
+      <w:r>
+        <w:t xml:space="preserve"> Somebody will see her Somebody will understand. The snake</w:t>
+      </w:r>
       <w:r>
         <w:t>?</w:t>
       </w:r>
     </w:p>
-    <w:p/>
-    <w:p>
-      <w:r>
-        <w:t>Do I need another building? The pole barn would be a good place for a snake.</w:t>
-      </w:r>
-    </w:p>
-    <w:p>
-      <w:r>
-        <w:t xml:space="preserve">I could end it here, with </w:t>
-      </w:r>
-      <w:proofErr w:type="spellStart"/>
-      <w:r>
-        <w:t>Drualissa</w:t>
-      </w:r>
-      <w:proofErr w:type="spellEnd"/>
-      <w:r>
-        <w:t xml:space="preserve"> arriving on the </w:t>
-      </w:r>
-      <w:proofErr w:type="gramStart"/>
-      <w:r>
-        <w:t>scene</w:t>
-      </w:r>
-      <w:proofErr w:type="gramEnd"/>
-      <w:r>
-        <w:t>.</w:t>
-      </w:r>
-    </w:p>
-    <w:p>
-      <w:r>
-        <w:t xml:space="preserve">Something </w:t>
-      </w:r>
-      <w:proofErr w:type="gramStart"/>
-      <w:r>
-        <w:t>going</w:t>
-      </w:r>
-      <w:proofErr w:type="gramEnd"/>
-      <w:r>
-        <w:t xml:space="preserve"> on with the animals. </w:t>
-      </w:r>
-      <w:r>
-        <w:t>That’s what I had in mind all along. The animals are drawing her out to kill h</w:t>
-      </w:r>
-      <w:r>
-        <w:t xml:space="preserve">er. How? Whatever </w:t>
-      </w:r>
-      <w:proofErr w:type="gramStart"/>
-      <w:r>
-        <w:t>it is</w:t>
-      </w:r>
-      <w:proofErr w:type="gramEnd"/>
-      <w:r>
-        <w:t xml:space="preserve"> fails. Probably because Buford broke something they needed with his device.</w:t>
-      </w:r>
-    </w:p>
-    <w:p>
-      <w:r>
-        <w:t xml:space="preserve">Something’s going on with the animals and </w:t>
-      </w:r>
-      <w:proofErr w:type="spellStart"/>
-      <w:r>
-        <w:t>Drualissa</w:t>
-      </w:r>
-      <w:proofErr w:type="spellEnd"/>
-      <w:r>
-        <w:t xml:space="preserve"> in the orchard while this is taking place, </w:t>
-      </w:r>
-      <w:proofErr w:type="gramStart"/>
-      <w:r>
-        <w:t>It’s</w:t>
-      </w:r>
-      <w:proofErr w:type="gramEnd"/>
-      <w:r>
-        <w:t xml:space="preserve"> almost successful, but it’s disrupted by a </w:t>
-      </w:r>
-      <w:r>
-        <w:t>flying hazelnut. Maybe they intend to turn the stacked pallets of hazelnuts over on her.</w:t>
-      </w:r>
-    </w:p>
-    <w:p>
-      <w:r>
-        <w:t xml:space="preserve">How would they </w:t>
-      </w:r>
-      <w:r>
-        <w:t xml:space="preserve">do that? </w:t>
-      </w:r>
-    </w:p>
-    <w:p>
-      <w:r>
-        <w:t>Something to do with the civil war?</w:t>
-      </w:r>
-    </w:p>
-    <w:p>
-      <w:r>
-        <w:t>Capture her.</w:t>
-      </w:r>
-    </w:p>
-    <w:p>
-      <w:r>
-        <w:t>Why would they need to capture her. With a net. Dropped from the pallet of coconuts.</w:t>
-      </w:r>
-    </w:p>
-    <w:p>
-      <w:r>
-        <w:t xml:space="preserve">What would you do with a </w:t>
-      </w:r>
-      <w:r>
-        <w:t>captured boa?</w:t>
-      </w:r>
-    </w:p>
-    <w:p>
-      <w:r>
-        <w:t>Where would they get a net?</w:t>
-      </w:r>
-    </w:p>
-    <w:p>
-      <w:r>
-        <w:t xml:space="preserve">Covered in </w:t>
-      </w:r>
-      <w:proofErr w:type="spellStart"/>
-      <w:r>
-        <w:t>Prailene</w:t>
-      </w:r>
-      <w:proofErr w:type="spellEnd"/>
-      <w:r>
-        <w:t xml:space="preserve"> Butter.</w:t>
-      </w:r>
-    </w:p>
-    <w:p>
-      <w:r>
-        <w:lastRenderedPageBreak/>
-        <w:t>Live specimen.</w:t>
-      </w:r>
-    </w:p>
-    <w:p>
-      <w:r>
-        <w:t>Maybe just continue the story.</w:t>
-      </w:r>
-      <w:r>
-        <w:t xml:space="preserve"> </w:t>
-      </w:r>
-      <w:proofErr w:type="spellStart"/>
-      <w:r>
-        <w:t>Mabye</w:t>
-      </w:r>
-      <w:proofErr w:type="spellEnd"/>
-      <w:r>
-        <w:t xml:space="preserve"> there’s some spell you can cast. Maybe they need information from her.</w:t>
-      </w:r>
-    </w:p>
-    <w:p>
-      <w:proofErr w:type="spellStart"/>
-      <w:r>
-        <w:t>Druallissa</w:t>
-      </w:r>
-      <w:proofErr w:type="spellEnd"/>
-      <w:r>
-        <w:t xml:space="preserve"> knows something!</w:t>
-      </w:r>
-      <w:r>
-        <w:t xml:space="preserve"> Where </w:t>
-      </w:r>
-      <w:proofErr w:type="gramStart"/>
-      <w:r>
-        <w:t>the truffles are</w:t>
-      </w:r>
-      <w:proofErr w:type="gramEnd"/>
-      <w:r>
-        <w:t>? The dogs should be able to smell them.</w:t>
-      </w:r>
-      <w:r>
-        <w:t xml:space="preserve"> </w:t>
-      </w:r>
-      <w:proofErr w:type="gramStart"/>
-      <w:r>
-        <w:t>There’s  cave</w:t>
-      </w:r>
-      <w:proofErr w:type="gramEnd"/>
-      <w:r>
-        <w:t>.</w:t>
-      </w:r>
-    </w:p>
-    <w:p>
-      <w:r>
-        <w:t xml:space="preserve">They need a net. Where will they get one? </w:t>
-      </w:r>
-    </w:p>
-    <w:p>
-      <w:r>
-        <w:t>Buford goes into the orchard and discovers a truffle. That’s why the snake gets him</w:t>
-      </w:r>
-      <w:r>
-        <w:t>. Or he stumbles upon Blind Marnie’s truffle hoard.</w:t>
-      </w:r>
-    </w:p>
-    <w:p/>
-    <w:p>
-      <w:r>
-        <w:t xml:space="preserve">Or he just really pisses Blind Marnie off. </w:t>
-      </w:r>
-    </w:p>
-    <w:p/>
-    <w:p>
-      <w:r>
-        <w:t xml:space="preserve">Blind Marnie has hatched something. Wes </w:t>
-      </w:r>
-      <w:proofErr w:type="gramStart"/>
-      <w:r>
-        <w:t>has hatched</w:t>
-      </w:r>
-      <w:proofErr w:type="gramEnd"/>
-      <w:r>
-        <w:t xml:space="preserve"> something to stop it. </w:t>
-      </w:r>
-    </w:p>
-    <w:p/>
-    <w:p>
-      <w:r>
-        <w:t xml:space="preserve">All this just to get Buford squeezed by a </w:t>
-      </w:r>
-      <w:proofErr w:type="gramStart"/>
-      <w:r>
-        <w:t>snake</w:t>
-      </w:r>
-      <w:r>
-        <w:t>?</w:t>
-      </w:r>
-      <w:proofErr w:type="gramEnd"/>
-      <w:r>
-        <w:t xml:space="preserve"> Maybe squeeze Wes Sooner.</w:t>
-      </w:r>
-    </w:p>
-    <w:p>
-      <w:r>
-        <w:t>Shit. I’m just now to the muddled middle.</w:t>
-      </w:r>
-    </w:p>
-    <w:p/>
-    <w:p>
-      <w:r>
-        <w:t>Muddled middle ends with Buford squeezed by the snake</w:t>
-      </w:r>
-      <w:r>
-        <w:t>, Mosey saving him.</w:t>
-      </w:r>
-    </w:p>
-    <w:p/>
-    <w:p>
-      <w:r>
-        <w:t>What about Blind Marnie</w:t>
-      </w:r>
-      <w:r>
-        <w:t xml:space="preserve"> </w:t>
-      </w:r>
-      <w:proofErr w:type="spellStart"/>
-      <w:proofErr w:type="gramStart"/>
-      <w:r>
-        <w:t>gatheringin</w:t>
-      </w:r>
-      <w:proofErr w:type="spellEnd"/>
-      <w:proofErr w:type="gramEnd"/>
-      <w:r>
-        <w:t xml:space="preserve"> the truffles. We haven’t even seen the wild hogs yet. </w:t>
-      </w:r>
-      <w:r>
-        <w:t>She goes with them one night in the fall. Find out when the truffles are ready and write that.</w:t>
-      </w:r>
-      <w:r>
-        <w:t xml:space="preserve"> Somebody will see her Somebody will understand. The snake</w:t>
-      </w:r>
-      <w:r>
-        <w:t>?</w:t>
-      </w:r>
-    </w:p>
     <w:p>
       <w:r>
         <w:t xml:space="preserve">Always pictured the snake chasing Chickpocalypse chasing the snake into </w:t>
@@ -4245,7 +4223,6 @@
     </w:p>
     <w:p>
       <w:r>
-        <w:lastRenderedPageBreak/>
         <w:t>“</w:t>
       </w:r>
       <w:r>
@@ -4894,7 +4871,6 @@
   <w:style w:type="character" w:default="1" w:styleId="DefaultParagraphFont">
     <w:name w:val="Default Paragraph Font"/>
     <w:uiPriority w:val="1"/>
-    <w:semiHidden/>
     <w:unhideWhenUsed/>
   </w:style>
   <w:style w:type="table" w:default="1" w:styleId="TableNormal">

</xml_diff>